<commit_message>
feat: Add multilingual support (DE/EN/ES) with complexity toggle
- Add locale-switch toggle (DE/EN/ES flags) and lang-level toggle
  (Leichte Sprache / Verständlich / Fachsprache) to all pages
- Translate all page content into English and Spanish using
  locale-de/locale-en/locale-es wrapper pattern and data-* attributes
- Add Spanish texts for all four landing page sections
  (KONZEPT, RIVUS, MYTHUS, GESICHTEN) from official ES document
- Translate hover-over image info texts (titles and media) in all three languages
- Invert German flag in Light-Mode when active / Dark-Mode when inactive

Co-Authored-By: Claude Sonnet 4.6 <noreply@anthropic.com>
</commit_message>
<xml_diff>
--- a/Texte/Abschnitte Work01.docx
+++ b/Texte/Abschnitte Work01.docx
@@ -127,6 +127,45 @@
       </w:r>
     </w:p>
     <w:p>
+      <w:pPr>
+        <w:numPr>
+          <w:ilvl w:val="0"/>
+          <w:numId w:val="3"/>
+        </w:numPr>
+      </w:pPr>
+      <w:r>
+        <w:t>Frage des Geschlechts thematisieren</w:t>
+      </w:r>
+    </w:p>
+    <w:p>
+      <w:pPr>
+        <w:numPr>
+          <w:ilvl w:val="0"/>
+          <w:numId w:val="3"/>
+        </w:numPr>
+      </w:pPr>
+      <w:r>
+        <w:t>In andere</w:t>
+      </w:r>
+      <w:r>
+        <w:t>n</w:t>
+      </w:r>
+      <w:r>
+        <w:t xml:space="preserve"> Arbeiten gehe ich Fragestellungen nach, die ich keinem Zyklus zuzuordnen vermag; u.a. einige Auftragsarbeiten</w:t>
+      </w:r>
+    </w:p>
+    <w:p>
+      <w:pPr>
+        <w:numPr>
+          <w:ilvl w:val="0"/>
+          <w:numId w:val="3"/>
+        </w:numPr>
+      </w:pPr>
+      <w:r>
+        <w:t>3 Werkzyklen: RIVUS, MYTHUS, GESICHTEN, die sich stilistisch, symbolisch und motivational voneinander abgrenzen lassen, wenn es in diesem Bereich trotzdem auch immer wieder Überschneidungen gibt</w:t>
+      </w:r>
+    </w:p>
+    <w:p>
       <w:proofErr w:type="spellStart"/>
       <w:r>
         <w:t>Lorem</w:t>
@@ -580,7 +619,6 @@
         </w:numPr>
       </w:pPr>
       <w:r>
-        <w:lastRenderedPageBreak/>
         <w:t>Blick auf andere Männer: Mal bewundernd, mal im Wettbewerb; unerreichbar oder längst überholt</w:t>
       </w:r>
     </w:p>
@@ -1144,6 +1182,7 @@
     <w:p>
       <w:proofErr w:type="spellStart"/>
       <w:r>
+        <w:lastRenderedPageBreak/>
         <w:t>Lorem</w:t>
       </w:r>
       <w:proofErr w:type="spellEnd"/>
@@ -2958,6 +2997,7 @@
   <w:style w:type="character" w:default="1" w:styleId="Absatz-Standardschriftart">
     <w:name w:val="Default Paragraph Font"/>
     <w:uiPriority w:val="1"/>
+    <w:semiHidden/>
     <w:unhideWhenUsed/>
   </w:style>
   <w:style w:type="table" w:default="1" w:styleId="NormaleTabelle">

</xml_diff>